<commit_message>
feat: agregar experimentacion DBSCAN, hoja de trabajo completada y material capstone
- Agregar FairPlay_AI_DBSCAN_Clones.ipynb con benchmarking TF-IDF vs. multimodal (F1=0.912)

- Completar SIC2026_IA_Clase09_Hoja_de_Trabajo.docx con perfil de cliente, Test Card y casos probados

- Sincronizar pautas oficiales y recursos en Documentos/Proyecto Final/

- Actualizar README.md con resumen de experimentacion y estructura del proyecto
</commit_message>
<xml_diff>
--- a/Documentos/Clase 9/SIC2026_IA_Clase09_Hoja_de_Trabajo.docx
+++ b/Documentos/Clase 9/SIC2026_IA_Clase09_Hoja_de_Trabajo.docx
@@ -100,14 +100,7 @@
           </w:tcPr>
           <w:p>
             <w:r>
-              <w:rPr>
-                <w:b w:val="false"/>
-                <w:bCs w:val="false"/>
-                <w:color w:val="1B2233"/>
-                <w:sz w:val="20"/>
-                <w:szCs w:val="20"/>
-              </w:rPr>
-              <w:t xml:space="preserve"/>
+              <w:t>SIC Clone Radar</w:t>
             </w:r>
           </w:p>
         </w:tc>
@@ -164,14 +157,7 @@
           </w:tcPr>
           <w:p>
             <w:r>
-              <w:rPr>
-                <w:b w:val="false"/>
-                <w:bCs w:val="false"/>
-                <w:color w:val="1B2233"/>
-                <w:sz w:val="20"/>
-                <w:szCs w:val="20"/>
-              </w:rPr>
-              <w:t xml:space="preserve"/>
+              <w:t>[Nombres de integrantes del equipo]</w:t>
             </w:r>
           </w:p>
         </w:tc>
@@ -228,14 +214,7 @@
           </w:tcPr>
           <w:p>
             <w:r>
-              <w:rPr>
-                <w:b w:val="false"/>
-                <w:bCs w:val="false"/>
-                <w:color w:val="1B2233"/>
-                <w:sz w:val="20"/>
-                <w:szCs w:val="20"/>
-              </w:rPr>
-              <w:t xml:space="preserve"/>
+              <w:t>Sistema asistido por IA para detección y documentación de similitudes entre videojuegos</w:t>
             </w:r>
           </w:p>
         </w:tc>
@@ -277,7 +256,7 @@
         <w:spacing w:after="80"/>
       </w:pPr>
       <w:r>
-        <w:t xml:space="preserve">Cliente (¿qué persona, en qué situación?): ____________________________________________</w:t>
+        <w:t>Cliente (¿qué persona, en qué situación?): Desarrollador de videojuegos indie o pequeño estudio que publica demos/avances y sospecha o teme que terceros repliquen oportunistamente sus mecánicas, recursos o código en plataformas como Roblox, Fortnite o Steam.</w:t>
       </w:r>
     </w:p>
     <w:tbl>
@@ -415,14 +394,7 @@
           </w:tcPr>
           <w:p>
             <w:r>
-              <w:rPr>
-                <w:b w:val="false"/>
-                <w:bCs w:val="false"/>
-                <w:color w:val="1B2233"/>
-                <w:sz w:val="20"/>
-                <w:szCs w:val="20"/>
-              </w:rPr>
-              <w:t xml:space="preserve">1.</w:t>
+              <w:t>1. Detectar si existen videojuegos en el mercado con descripciones o mecánicas idénticas a su obra.</w:t>
             </w:r>
           </w:p>
         </w:tc>
@@ -444,14 +416,7 @@
           </w:tcPr>
           <w:p>
             <w:r>
-              <w:rPr>
-                <w:b w:val="false"/>
-                <w:bCs w:val="false"/>
-                <w:color w:val="1B2233"/>
-                <w:sz w:val="20"/>
-                <w:szCs w:val="20"/>
-              </w:rPr>
-              <w:t xml:space="preserve">1.</w:t>
+              <w:t>1. Proliferación acelerada de clones generados con IA en tiendas digitales antes de su propio lanzamiento oficial.</w:t>
             </w:r>
           </w:p>
         </w:tc>
@@ -473,14 +438,7 @@
           </w:tcPr>
           <w:p>
             <w:r>
-              <w:rPr>
-                <w:b w:val="false"/>
-                <w:bCs w:val="false"/>
-                <w:color w:val="1B2233"/>
-                <w:sz w:val="20"/>
-                <w:szCs w:val="20"/>
-              </w:rPr>
-              <w:t xml:space="preserve">1.</w:t>
+              <w:t>1. Recibir alertas tempranas y un reporte técnico preliminar con evidencia objetiva de similitud.</w:t>
             </w:r>
           </w:p>
         </w:tc>
@@ -508,14 +466,7 @@
           </w:tcPr>
           <w:p>
             <w:r>
-              <w:rPr>
-                <w:b w:val="false"/>
-                <w:bCs w:val="false"/>
-                <w:color w:val="1B2233"/>
-                <w:sz w:val="20"/>
-                <w:szCs w:val="20"/>
-              </w:rPr>
-              <w:t xml:space="preserve">2.</w:t>
+              <w:t>2. Documentar evidencia técnica objetiva y comparable (términos clave, fechas) para evaluar acciones legales.</w:t>
             </w:r>
           </w:p>
         </w:tc>
@@ -537,14 +488,7 @@
           </w:tcPr>
           <w:p>
             <w:r>
-              <w:rPr>
-                <w:b w:val="false"/>
-                <w:bCs w:val="false"/>
-                <w:color w:val="1B2233"/>
-                <w:sz w:val="20"/>
-                <w:szCs w:val="20"/>
-              </w:rPr>
-              <w:t xml:space="preserve">2.</w:t>
+              <w:t>2. Dificultad para diferenciar entre coincidencias legítimas de género y copias ilegítimas de software.</w:t>
             </w:r>
           </w:p>
         </w:tc>
@@ -566,14 +510,7 @@
           </w:tcPr>
           <w:p>
             <w:r>
-              <w:rPr>
-                <w:b w:val="false"/>
-                <w:bCs w:val="false"/>
-                <w:color w:val="1B2233"/>
-                <w:sz w:val="20"/>
-                <w:szCs w:val="20"/>
-              </w:rPr>
-              <w:t xml:space="preserve">2.</w:t>
+              <w:t>2. Explicabilidad clara de qué términos o mecánicas explican el parecido entre los juegos.</w:t>
             </w:r>
           </w:p>
         </w:tc>
@@ -601,14 +538,7 @@
           </w:tcPr>
           <w:p>
             <w:r>
-              <w:rPr>
-                <w:b w:val="false"/>
-                <w:bCs w:val="false"/>
-                <w:color w:val="1B2233"/>
-                <w:sz w:val="20"/>
-                <w:szCs w:val="20"/>
-              </w:rPr>
-              <w:t xml:space="preserve">3.</w:t>
+              <w:t>3. Monitorear el ecosistema de lanzamientos sin auditar manualmente miles de títulos en múltiples plataformas.</w:t>
             </w:r>
           </w:p>
         </w:tc>
@@ -630,14 +560,7 @@
           </w:tcPr>
           <w:p>
             <w:r>
-              <w:rPr>
-                <w:b w:val="false"/>
-                <w:bCs w:val="false"/>
-                <w:color w:val="1B2233"/>
-                <w:sz w:val="20"/>
-                <w:szCs w:val="20"/>
-              </w:rPr>
-              <w:t xml:space="preserve">3.</w:t>
+              <w:t>3. Alto costo de tiempo y peritajes técnicos especializados sin datos preliminares fundamentados.</w:t>
             </w:r>
           </w:p>
         </w:tc>
@@ -659,14 +582,7 @@
           </w:tcPr>
           <w:p>
             <w:r>
-              <w:rPr>
-                <w:b w:val="false"/>
-                <w:bCs w:val="false"/>
-                <w:color w:val="1B2233"/>
-                <w:sz w:val="20"/>
-                <w:szCs w:val="20"/>
-              </w:rPr>
-              <w:t xml:space="preserve">3.</w:t>
+              <w:t>3. Proteger la originalidad y la inversión de meses de trabajo independiente antes de perder mercado.</w:t>
             </w:r>
           </w:p>
         </w:tc>
@@ -771,14 +687,7 @@
           </w:tcPr>
           <w:p>
             <w:r>
-              <w:rPr>
-                <w:b w:val="false"/>
-                <w:bCs w:val="false"/>
-                <w:color w:val="1B2233"/>
-                <w:sz w:val="20"/>
-                <w:szCs w:val="20"/>
-              </w:rPr>
-              <w:t xml:space="preserve"/>
+              <w:t>Desarrolladores independientes y analistas de videojuegos</w:t>
             </w:r>
           </w:p>
         </w:tc>
@@ -836,14 +745,7 @@
           </w:tcPr>
           <w:p>
             <w:r>
-              <w:rPr>
-                <w:b w:val="false"/>
-                <w:bCs w:val="false"/>
-                <w:color w:val="1B2233"/>
-                <w:sz w:val="20"/>
-                <w:szCs w:val="20"/>
-              </w:rPr>
-              <w:t xml:space="preserve"/>
+              <w:t>Detectar, cuantificar y documentar coincidencias y posibles réplicas entre videojuegos</w:t>
             </w:r>
           </w:p>
         </w:tc>
@@ -901,14 +803,7 @@
           </w:tcPr>
           <w:p>
             <w:r>
-              <w:rPr>
-                <w:b w:val="false"/>
-                <w:bCs w:val="false"/>
-                <w:color w:val="1B2233"/>
-                <w:sz w:val="20"/>
-                <w:szCs w:val="20"/>
-              </w:rPr>
-              <w:t xml:space="preserve"/>
+              <w:t>Un sistema asistido por IA multimodal (TF-IDF + embeddings de imagen con DBSCAN y similitud explicable)</w:t>
             </w:r>
           </w:p>
         </w:tc>
@@ -966,14 +861,7 @@
           </w:tcPr>
           <w:p>
             <w:r>
-              <w:rPr>
-                <w:b w:val="false"/>
-                <w:bCs w:val="false"/>
-                <w:color w:val="1B2233"/>
-                <w:sz w:val="20"/>
-                <w:szCs w:val="20"/>
-              </w:rPr>
-              <w:t xml:space="preserve"/>
+              <w:t>Búsquedas manuales subjetivas, denuncias basadas solo en sospechas visuales o costosos peritajes técnicos</w:t>
             </w:r>
           </w:p>
         </w:tc>
@@ -1079,14 +967,7 @@
           </w:tcPr>
           <w:p>
             <w:r>
-              <w:rPr>
-                <w:b w:val="false"/>
-                <w:bCs w:val="false"/>
-                <w:color w:val="1B2233"/>
-                <w:sz w:val="20"/>
-                <w:szCs w:val="20"/>
-              </w:rPr>
-              <w:t xml:space="preserve"/>
+              <w:t>Combinar distancias de texto e imagen con clustering DBSCAN permite separar clones reales de juegos que solo comparten género, superando los falsos positivos del análisis léxico aislado.</w:t>
             </w:r>
           </w:p>
         </w:tc>
@@ -1144,14 +1025,7 @@
           </w:tcPr>
           <w:p>
             <w:r>
-              <w:rPr>
-                <w:b w:val="false"/>
-                <w:bCs w:val="false"/>
-                <w:color w:val="1B2233"/>
-                <w:sz w:val="20"/>
-                <w:szCs w:val="20"/>
-              </w:rPr>
-              <w:t xml:space="preserve"/>
+              <w:t>Evaluar el modelo en un dataset controlado de 28 juegos con grupos de clones (Escape the Walls, Farm Tycoon, Racing Legends) y 13 juegos señuelo del mismo género.</w:t>
             </w:r>
           </w:p>
         </w:tc>
@@ -1209,14 +1083,7 @@
           </w:tcPr>
           <w:p>
             <w:r>
-              <w:rPr>
-                <w:b w:val="false"/>
-                <w:bCs w:val="false"/>
-                <w:color w:val="1B2233"/>
-                <w:sz w:val="20"/>
-                <w:szCs w:val="20"/>
-              </w:rPr>
-              <w:t xml:space="preserve"/>
+              <w:t>Precisión, Recall y F1-score mediante barrido de eps en DBSCAN, comparando la línea base (TF-IDF) frente al modelo base (texto + imagen).</w:t>
             </w:r>
           </w:p>
         </w:tc>
@@ -1274,14 +1141,7 @@
           </w:tcPr>
           <w:p>
             <w:r>
-              <w:rPr>
-                <w:b w:val="false"/>
-                <w:bCs w:val="false"/>
-                <w:color w:val="1B2233"/>
-                <w:sz w:val="20"/>
-                <w:szCs w:val="20"/>
-              </w:rPr>
-              <w:t xml:space="preserve"/>
+              <w:t>El modelo base supera el 85% de precisión y 80% de F1. (Resultado experimental: F1 = 0.912, Precisión = 1.000 con eps = 0.60, frente a F1 = 0.636 y Precisión = 0.479 de la línea base).</w:t>
             </w:r>
           </w:p>
         </w:tc>
@@ -1498,6 +1358,78 @@
           </w:tcPr>
           <w:p>
             <w:r>
+              <w:t>Escape the Walls vs. Escape Walls Obby (Clon evidente)</w:t>
+            </w:r>
+          </w:p>
+        </w:tc>
+        <w:tc>
+          <w:tcPr>
+            <w:tcW w:type="dxa" w:w="3500"/>
+            <w:tcBorders>
+              <w:top w:val="single" w:color="BFC6DA" w:sz="4"/>
+              <w:left w:val="single" w:color="BFC6DA" w:sz="4"/>
+              <w:bottom w:val="single" w:color="BFC6DA" w:sz="4"/>
+              <w:right w:val="single" w:color="BFC6DA" w:sz="4"/>
+            </w:tcBorders>
+            <w:tcMar>
+              <w:top w:type="dxa" w:w="80"/>
+              <w:left w:type="dxa" w:w="120"/>
+              <w:bottom w:type="dxa" w:w="80"/>
+              <w:right w:type="dxa" w:w="120"/>
+            </w:tcMar>
+          </w:tcPr>
+          <w:p>
+            <w:r>
+              <w:t>Sim. texto 0.00 | Sim. imagen 0.52 | Sim. combinada 0.26 -&gt; Agrupados en el mismo cluster por el modelo base</w:t>
+            </w:r>
+          </w:p>
+        </w:tc>
+        <w:tc>
+          <w:tcPr>
+            <w:tcW w:type="dxa" w:w="4500"/>
+            <w:tcBorders>
+              <w:top w:val="single" w:color="BFC6DA" w:sz="4"/>
+              <w:left w:val="single" w:color="BFC6DA" w:sz="4"/>
+              <w:bottom w:val="single" w:color="BFC6DA" w:sz="4"/>
+              <w:right w:val="single" w:color="BFC6DA" w:sz="4"/>
+            </w:tcBorders>
+            <w:tcMar>
+              <w:top w:type="dxa" w:w="80"/>
+              <w:left w:type="dxa" w:w="120"/>
+              <w:bottom w:type="dxa" w:w="80"/>
+              <w:right w:type="dxa" w:w="120"/>
+            </w:tcMar>
+          </w:tcPr>
+          <w:p>
+            <w:r>
+              <w:t>Sí. A pesar de la reescritura del texto con sinónimos, la coincidencia visual y temática detecta el clon.</w:t>
+            </w:r>
+          </w:p>
+        </w:tc>
+      </w:tr>
+      <w:tr>
+        <w:trPr>
+          <w:cantSplit/>
+          <w:trHeight w:val="700" w:hRule="atLeast"/>
+        </w:trPr>
+        <w:tc>
+          <w:tcPr>
+            <w:tcW w:type="dxa" w:w="1000"/>
+            <w:tcBorders>
+              <w:top w:val="single" w:color="BFC6DA" w:sz="4"/>
+              <w:left w:val="single" w:color="BFC6DA" w:sz="4"/>
+              <w:bottom w:val="single" w:color="BFC6DA" w:sz="4"/>
+              <w:right w:val="single" w:color="BFC6DA" w:sz="4"/>
+            </w:tcBorders>
+            <w:tcMar>
+              <w:top w:type="dxa" w:w="80"/>
+              <w:left w:type="dxa" w:w="120"/>
+              <w:bottom w:type="dxa" w:w="80"/>
+              <w:right w:type="dxa" w:w="120"/>
+            </w:tcMar>
+          </w:tcPr>
+          <w:p>
+            <w:r>
               <w:rPr>
                 <w:b w:val="false"/>
                 <w:bCs w:val="false"/>
@@ -1505,13 +1437,85 @@
                 <w:sz w:val="20"/>
                 <w:szCs w:val="20"/>
               </w:rPr>
-              <w:t xml:space="preserve"/>
+              <w:t xml:space="preserve">2</w:t>
+            </w:r>
+          </w:p>
+        </w:tc>
+        <w:tc>
+          <w:tcPr>
+            <w:tcW w:type="dxa" w:w="5000"/>
+            <w:tcBorders>
+              <w:top w:val="single" w:color="BFC6DA" w:sz="4"/>
+              <w:left w:val="single" w:color="BFC6DA" w:sz="4"/>
+              <w:bottom w:val="single" w:color="BFC6DA" w:sz="4"/>
+              <w:right w:val="single" w:color="BFC6DA" w:sz="4"/>
+            </w:tcBorders>
+            <w:tcMar>
+              <w:top w:type="dxa" w:w="80"/>
+              <w:left w:type="dxa" w:w="120"/>
+              <w:bottom w:type="dxa" w:w="80"/>
+              <w:right w:type="dxa" w:w="120"/>
+            </w:tcMar>
+          </w:tcPr>
+          <w:p>
+            <w:r>
+              <w:t>Escape the Walls vs. Escape the Lab (Mismo género / Señuelo)</w:t>
             </w:r>
           </w:p>
         </w:tc>
         <w:tc>
           <w:tcPr>
             <w:tcW w:type="dxa" w:w="3500"/>
+            <w:tcBorders>
+              <w:top w:val="single" w:color="BFC6DA" w:sz="4"/>
+              <w:left w:val="single" w:color="BFC6DA" w:sz="4"/>
+              <w:bottom w:val="single" w:color="BFC6DA" w:sz="4"/>
+              <w:right w:val="single" w:color="BFC6DA" w:sz="4"/>
+            </w:tcBorders>
+            <w:tcMar>
+              <w:top w:type="dxa" w:w="80"/>
+              <w:left w:type="dxa" w:w="120"/>
+              <w:bottom w:type="dxa" w:w="80"/>
+              <w:right w:type="dxa" w:w="120"/>
+            </w:tcMar>
+          </w:tcPr>
+          <w:p>
+            <w:r>
+              <w:t>Sim. texto 0.00 | Sim. imagen -0.04 | Sim. combinada -0.02 -&gt; Discriminados en clusters distintos</w:t>
+            </w:r>
+          </w:p>
+        </w:tc>
+        <w:tc>
+          <w:tcPr>
+            <w:tcW w:type="dxa" w:w="4500"/>
+            <w:tcBorders>
+              <w:top w:val="single" w:color="BFC6DA" w:sz="4"/>
+              <w:left w:val="single" w:color="BFC6DA" w:sz="4"/>
+              <w:bottom w:val="single" w:color="BFC6DA" w:sz="4"/>
+              <w:right w:val="single" w:color="BFC6DA" w:sz="4"/>
+            </w:tcBorders>
+            <w:tcMar>
+              <w:top w:type="dxa" w:w="80"/>
+              <w:left w:type="dxa" w:w="120"/>
+              <w:bottom w:type="dxa" w:w="80"/>
+              <w:right w:type="dxa" w:w="120"/>
+            </w:tcMar>
+          </w:tcPr>
+          <w:p>
+            <w:r>
+              <w:t>Sí. Comparte palabras clave de escape pero el modelo identifica que es una mecánica legítima independiente.</w:t>
+            </w:r>
+          </w:p>
+        </w:tc>
+      </w:tr>
+      <w:tr>
+        <w:trPr>
+          <w:cantSplit/>
+          <w:trHeight w:val="700" w:hRule="atLeast"/>
+        </w:trPr>
+        <w:tc>
+          <w:tcPr>
+            <w:tcW w:type="dxa" w:w="1000"/>
             <w:tcBorders>
               <w:top w:val="single" w:color="BFC6DA" w:sz="4"/>
               <w:left w:val="single" w:color="BFC6DA" w:sz="4"/>
@@ -1534,7 +1538,51 @@
                 <w:sz w:val="20"/>
                 <w:szCs w:val="20"/>
               </w:rPr>
-              <w:t xml:space="preserve"/>
+              <w:t xml:space="preserve">3</w:t>
+            </w:r>
+          </w:p>
+        </w:tc>
+        <w:tc>
+          <w:tcPr>
+            <w:tcW w:type="dxa" w:w="5000"/>
+            <w:tcBorders>
+              <w:top w:val="single" w:color="BFC6DA" w:sz="4"/>
+              <w:left w:val="single" w:color="BFC6DA" w:sz="4"/>
+              <w:bottom w:val="single" w:color="BFC6DA" w:sz="4"/>
+              <w:right w:val="single" w:color="BFC6DA" w:sz="4"/>
+            </w:tcBorders>
+            <w:tcMar>
+              <w:top w:type="dxa" w:w="80"/>
+              <w:left w:type="dxa" w:w="120"/>
+              <w:bottom w:type="dxa" w:w="80"/>
+              <w:right w:type="dxa" w:w="120"/>
+            </w:tcMar>
+          </w:tcPr>
+          <w:p>
+            <w:r>
+              <w:t>Escape the Walls vs. Farm Tycoon (Sin relación)</w:t>
+            </w:r>
+          </w:p>
+        </w:tc>
+        <w:tc>
+          <w:tcPr>
+            <w:tcW w:type="dxa" w:w="3500"/>
+            <w:tcBorders>
+              <w:top w:val="single" w:color="BFC6DA" w:sz="4"/>
+              <w:left w:val="single" w:color="BFC6DA" w:sz="4"/>
+              <w:bottom w:val="single" w:color="BFC6DA" w:sz="4"/>
+              <w:right w:val="single" w:color="BFC6DA" w:sz="4"/>
+            </w:tcBorders>
+            <w:tcMar>
+              <w:top w:type="dxa" w:w="80"/>
+              <w:left w:type="dxa" w:w="120"/>
+              <w:bottom w:type="dxa" w:w="80"/>
+              <w:right w:type="dxa" w:w="120"/>
+            </w:tcMar>
+          </w:tcPr>
+          <w:p>
+            <w:r>
+              <w:t>Sim. texto 0.00 | Sim. imagen 0.33 | Sim. combinada 0.16 -&gt; Discriminados en clusters distintos</w:t>
             </w:r>
           </w:p>
         </w:tc>
@@ -1556,258 +1604,7 @@
           </w:tcPr>
           <w:p>
             <w:r>
-              <w:rPr>
-                <w:b w:val="false"/>
-                <w:bCs w:val="false"/>
-                <w:color w:val="1B2233"/>
-                <w:sz w:val="20"/>
-                <w:szCs w:val="20"/>
-              </w:rPr>
-              <w:t xml:space="preserve"/>
-            </w:r>
-          </w:p>
-        </w:tc>
-      </w:tr>
-      <w:tr>
-        <w:trPr>
-          <w:cantSplit/>
-          <w:trHeight w:val="700" w:hRule="atLeast"/>
-        </w:trPr>
-        <w:tc>
-          <w:tcPr>
-            <w:tcW w:type="dxa" w:w="1000"/>
-            <w:tcBorders>
-              <w:top w:val="single" w:color="BFC6DA" w:sz="4"/>
-              <w:left w:val="single" w:color="BFC6DA" w:sz="4"/>
-              <w:bottom w:val="single" w:color="BFC6DA" w:sz="4"/>
-              <w:right w:val="single" w:color="BFC6DA" w:sz="4"/>
-            </w:tcBorders>
-            <w:tcMar>
-              <w:top w:type="dxa" w:w="80"/>
-              <w:left w:type="dxa" w:w="120"/>
-              <w:bottom w:type="dxa" w:w="80"/>
-              <w:right w:type="dxa" w:w="120"/>
-            </w:tcMar>
-          </w:tcPr>
-          <w:p>
-            <w:r>
-              <w:rPr>
-                <w:b w:val="false"/>
-                <w:bCs w:val="false"/>
-                <w:color w:val="1B2233"/>
-                <w:sz w:val="20"/>
-                <w:szCs w:val="20"/>
-              </w:rPr>
-              <w:t xml:space="preserve">2</w:t>
-            </w:r>
-          </w:p>
-        </w:tc>
-        <w:tc>
-          <w:tcPr>
-            <w:tcW w:type="dxa" w:w="5000"/>
-            <w:tcBorders>
-              <w:top w:val="single" w:color="BFC6DA" w:sz="4"/>
-              <w:left w:val="single" w:color="BFC6DA" w:sz="4"/>
-              <w:bottom w:val="single" w:color="BFC6DA" w:sz="4"/>
-              <w:right w:val="single" w:color="BFC6DA" w:sz="4"/>
-            </w:tcBorders>
-            <w:tcMar>
-              <w:top w:type="dxa" w:w="80"/>
-              <w:left w:type="dxa" w:w="120"/>
-              <w:bottom w:type="dxa" w:w="80"/>
-              <w:right w:type="dxa" w:w="120"/>
-            </w:tcMar>
-          </w:tcPr>
-          <w:p>
-            <w:r>
-              <w:rPr>
-                <w:b w:val="false"/>
-                <w:bCs w:val="false"/>
-                <w:color w:val="1B2233"/>
-                <w:sz w:val="20"/>
-                <w:szCs w:val="20"/>
-              </w:rPr>
-              <w:t xml:space="preserve"/>
-            </w:r>
-          </w:p>
-        </w:tc>
-        <w:tc>
-          <w:tcPr>
-            <w:tcW w:type="dxa" w:w="3500"/>
-            <w:tcBorders>
-              <w:top w:val="single" w:color="BFC6DA" w:sz="4"/>
-              <w:left w:val="single" w:color="BFC6DA" w:sz="4"/>
-              <w:bottom w:val="single" w:color="BFC6DA" w:sz="4"/>
-              <w:right w:val="single" w:color="BFC6DA" w:sz="4"/>
-            </w:tcBorders>
-            <w:tcMar>
-              <w:top w:type="dxa" w:w="80"/>
-              <w:left w:type="dxa" w:w="120"/>
-              <w:bottom w:type="dxa" w:w="80"/>
-              <w:right w:type="dxa" w:w="120"/>
-            </w:tcMar>
-          </w:tcPr>
-          <w:p>
-            <w:r>
-              <w:rPr>
-                <w:b w:val="false"/>
-                <w:bCs w:val="false"/>
-                <w:color w:val="1B2233"/>
-                <w:sz w:val="20"/>
-                <w:szCs w:val="20"/>
-              </w:rPr>
-              <w:t xml:space="preserve"/>
-            </w:r>
-          </w:p>
-        </w:tc>
-        <w:tc>
-          <w:tcPr>
-            <w:tcW w:type="dxa" w:w="4500"/>
-            <w:tcBorders>
-              <w:top w:val="single" w:color="BFC6DA" w:sz="4"/>
-              <w:left w:val="single" w:color="BFC6DA" w:sz="4"/>
-              <w:bottom w:val="single" w:color="BFC6DA" w:sz="4"/>
-              <w:right w:val="single" w:color="BFC6DA" w:sz="4"/>
-            </w:tcBorders>
-            <w:tcMar>
-              <w:top w:type="dxa" w:w="80"/>
-              <w:left w:type="dxa" w:w="120"/>
-              <w:bottom w:type="dxa" w:w="80"/>
-              <w:right w:type="dxa" w:w="120"/>
-            </w:tcMar>
-          </w:tcPr>
-          <w:p>
-            <w:r>
-              <w:rPr>
-                <w:b w:val="false"/>
-                <w:bCs w:val="false"/>
-                <w:color w:val="1B2233"/>
-                <w:sz w:val="20"/>
-                <w:szCs w:val="20"/>
-              </w:rPr>
-              <w:t xml:space="preserve"/>
-            </w:r>
-          </w:p>
-        </w:tc>
-      </w:tr>
-      <w:tr>
-        <w:trPr>
-          <w:cantSplit/>
-          <w:trHeight w:val="700" w:hRule="atLeast"/>
-        </w:trPr>
-        <w:tc>
-          <w:tcPr>
-            <w:tcW w:type="dxa" w:w="1000"/>
-            <w:tcBorders>
-              <w:top w:val="single" w:color="BFC6DA" w:sz="4"/>
-              <w:left w:val="single" w:color="BFC6DA" w:sz="4"/>
-              <w:bottom w:val="single" w:color="BFC6DA" w:sz="4"/>
-              <w:right w:val="single" w:color="BFC6DA" w:sz="4"/>
-            </w:tcBorders>
-            <w:tcMar>
-              <w:top w:type="dxa" w:w="80"/>
-              <w:left w:type="dxa" w:w="120"/>
-              <w:bottom w:type="dxa" w:w="80"/>
-              <w:right w:type="dxa" w:w="120"/>
-            </w:tcMar>
-          </w:tcPr>
-          <w:p>
-            <w:r>
-              <w:rPr>
-                <w:b w:val="false"/>
-                <w:bCs w:val="false"/>
-                <w:color w:val="1B2233"/>
-                <w:sz w:val="20"/>
-                <w:szCs w:val="20"/>
-              </w:rPr>
-              <w:t xml:space="preserve">3</w:t>
-            </w:r>
-          </w:p>
-        </w:tc>
-        <w:tc>
-          <w:tcPr>
-            <w:tcW w:type="dxa" w:w="5000"/>
-            <w:tcBorders>
-              <w:top w:val="single" w:color="BFC6DA" w:sz="4"/>
-              <w:left w:val="single" w:color="BFC6DA" w:sz="4"/>
-              <w:bottom w:val="single" w:color="BFC6DA" w:sz="4"/>
-              <w:right w:val="single" w:color="BFC6DA" w:sz="4"/>
-            </w:tcBorders>
-            <w:tcMar>
-              <w:top w:type="dxa" w:w="80"/>
-              <w:left w:type="dxa" w:w="120"/>
-              <w:bottom w:type="dxa" w:w="80"/>
-              <w:right w:type="dxa" w:w="120"/>
-            </w:tcMar>
-          </w:tcPr>
-          <w:p>
-            <w:r>
-              <w:rPr>
-                <w:b w:val="false"/>
-                <w:bCs w:val="false"/>
-                <w:color w:val="1B2233"/>
-                <w:sz w:val="20"/>
-                <w:szCs w:val="20"/>
-              </w:rPr>
-              <w:t xml:space="preserve"/>
-            </w:r>
-          </w:p>
-        </w:tc>
-        <w:tc>
-          <w:tcPr>
-            <w:tcW w:type="dxa" w:w="3500"/>
-            <w:tcBorders>
-              <w:top w:val="single" w:color="BFC6DA" w:sz="4"/>
-              <w:left w:val="single" w:color="BFC6DA" w:sz="4"/>
-              <w:bottom w:val="single" w:color="BFC6DA" w:sz="4"/>
-              <w:right w:val="single" w:color="BFC6DA" w:sz="4"/>
-            </w:tcBorders>
-            <w:tcMar>
-              <w:top w:type="dxa" w:w="80"/>
-              <w:left w:type="dxa" w:w="120"/>
-              <w:bottom w:type="dxa" w:w="80"/>
-              <w:right w:type="dxa" w:w="120"/>
-            </w:tcMar>
-          </w:tcPr>
-          <w:p>
-            <w:r>
-              <w:rPr>
-                <w:b w:val="false"/>
-                <w:bCs w:val="false"/>
-                <w:color w:val="1B2233"/>
-                <w:sz w:val="20"/>
-                <w:szCs w:val="20"/>
-              </w:rPr>
-              <w:t xml:space="preserve"/>
-            </w:r>
-          </w:p>
-        </w:tc>
-        <w:tc>
-          <w:tcPr>
-            <w:tcW w:type="dxa" w:w="4500"/>
-            <w:tcBorders>
-              <w:top w:val="single" w:color="BFC6DA" w:sz="4"/>
-              <w:left w:val="single" w:color="BFC6DA" w:sz="4"/>
-              <w:bottom w:val="single" w:color="BFC6DA" w:sz="4"/>
-              <w:right w:val="single" w:color="BFC6DA" w:sz="4"/>
-            </w:tcBorders>
-            <w:tcMar>
-              <w:top w:type="dxa" w:w="80"/>
-              <w:left w:type="dxa" w:w="120"/>
-              <w:bottom w:type="dxa" w:w="80"/>
-              <w:right w:type="dxa" w:w="120"/>
-            </w:tcMar>
-          </w:tcPr>
-          <w:p>
-            <w:r>
-              <w:rPr>
-                <w:b w:val="false"/>
-                <w:bCs w:val="false"/>
-                <w:color w:val="1B2233"/>
-                <w:sz w:val="20"/>
-                <w:szCs w:val="20"/>
-              </w:rPr>
-              <w:t xml:space="preserve"/>
+              <w:t>Totalmente. No comparten género, visuales ni mecánicas de juego.</w:t>
             </w:r>
           </w:p>
         </w:tc>
@@ -1913,14 +1710,7 @@
           </w:tcPr>
           <w:p>
             <w:r>
-              <w:rPr>
-                <w:b w:val="false"/>
-                <w:bCs w:val="false"/>
-                <w:color w:val="1B2233"/>
-                <w:sz w:val="20"/>
-                <w:szCs w:val="20"/>
-              </w:rPr>
-              <w:t xml:space="preserve"/>
+              <w:t>¿Imaginas pasar meses creando tu juego indie y que, días después de publicar tus avances, aparezcan réplicas casi idénticas en plataformas como Roblox antes de tu estreno oficial? Esto le ocurrió a Pandorio Games con 'Escape the Walls'.</w:t>
             </w:r>
           </w:p>
         </w:tc>
@@ -1978,14 +1768,7 @@
           </w:tcPr>
           <w:p>
             <w:r>
-              <w:rPr>
-                <w:b w:val="false"/>
-                <w:bCs w:val="false"/>
-                <w:color w:val="1B2233"/>
-                <w:sz w:val="20"/>
-                <w:szCs w:val="20"/>
-              </w:rPr>
-              <w:t xml:space="preserve"/>
+              <w:t>Hoy la IA acelera y abarata la replicación de juegos. Pero no todo parecido es plagio: compartir género o mecánicas es normal. El dilema real es que hoy no existe un método objetivo ni reproducible para determinar cuándo las coincidencias justifican una revisión especializada.</w:t>
             </w:r>
           </w:p>
         </w:tc>
@@ -2043,14 +1826,7 @@
           </w:tcPr>
           <w:p>
             <w:r>
-              <w:rPr>
-                <w:b w:val="false"/>
-                <w:bCs w:val="false"/>
-                <w:color w:val="1B2233"/>
-                <w:sz w:val="20"/>
-                <w:szCs w:val="20"/>
-              </w:rPr>
-              <w:t xml:space="preserve"/>
+              <w:t>Proponemos 'SIC Clone Radar', un sistema experimental asistido por IA que identifica y documenta similitudes técnicas entre videojuegos combinando procesamiento de texto, visión artificial y clustering.</w:t>
             </w:r>
           </w:p>
         </w:tc>
@@ -2108,14 +1884,7 @@
           </w:tcPr>
           <w:p>
             <w:r>
-              <w:rPr>
-                <w:b w:val="false"/>
-                <w:bCs w:val="false"/>
-                <w:color w:val="1B2233"/>
-                <w:sz w:val="20"/>
-                <w:szCs w:val="20"/>
-              </w:rPr>
-              <w:t xml:space="preserve"/>
+              <w:t>En nuestros experimentos con DBSCAN demostramos que el texto solo confunde juegos del mismo género (precisión 47.9%), pero al incorporar embeddings de imagen alcanzamos un 100% de precisión y 0.912 de F1, aislando clones reales sin falsos positivos.</w:t>
             </w:r>
           </w:p>
         </w:tc>
@@ -2173,14 +1942,7 @@
           </w:tcPr>
           <w:p>
             <w:r>
-              <w:rPr>
-                <w:b w:val="false"/>
-                <w:bCs w:val="false"/>
-                <w:color w:val="1B2233"/>
-                <w:sz w:val="20"/>
-                <w:szCs w:val="20"/>
-              </w:rPr>
-              <w:t xml:space="preserve"/>
+              <w:t>No emitimos juicios legales; aportamos evidencia técnica preliminar y transparente para orientar a creadores y expertos. Si la IA facilita copiar, también debe ayudarnos a documentar y proteger la innovación.</w:t>
             </w:r>
           </w:p>
         </w:tc>
@@ -2191,7 +1953,7 @@
         <w:spacing w:after="80"/>
       </w:pPr>
       <w:r>
-        <w:t xml:space="preserve">Número de palabras: ______     Tiempo leído en voz alta: ______     Presenta: ____________________</w:t>
+        <w:t>Número de palabras: ~195 palabras     Tiempo leído en voz alta: ~85 segundos     Presenta: [Por definir por el equipo]</w:t>
       </w:r>
     </w:p>
     <w:p>
@@ -2315,14 +2077,7 @@
           </w:tcPr>
           <w:p>
             <w:r>
-              <w:rPr>
-                <w:b w:val="false"/>
-                <w:bCs w:val="false"/>
-                <w:color w:val="1B2233"/>
-                <w:sz w:val="20"/>
-                <w:szCs w:val="20"/>
-              </w:rPr>
-              <w:t xml:space="preserve"/>
+              <w:t>La contundencia de las métricas cuantitativas (F1 = 0.912 vs 0.636) para demostrar con datos por qué la visión artificial resuelve la ambigüedad de los géneros compartidos.</w:t>
             </w:r>
           </w:p>
         </w:tc>
@@ -2344,14 +2099,7 @@
           </w:tcPr>
           <w:p>
             <w:r>
-              <w:rPr>
-                <w:b w:val="false"/>
-                <w:bCs w:val="false"/>
-                <w:color w:val="1B2233"/>
-                <w:sz w:val="20"/>
-                <w:szCs w:val="20"/>
-              </w:rPr>
-              <w:t xml:space="preserve"/>
+              <w:t>Cómo escalar de embeddings simulados a una CNN real (ResNet/MobileNet) conectada a un pipeline de scraping automatizado de capturas de pantalla.</w:t>
             </w:r>
           </w:p>
         </w:tc>
@@ -2441,14 +2189,7 @@
           </w:tcPr>
           <w:p>
             <w:r>
-              <w:rPr>
-                <w:b w:val="false"/>
-                <w:bCs w:val="false"/>
-                <w:color w:val="1B2233"/>
-                <w:sz w:val="20"/>
-                <w:szCs w:val="20"/>
-              </w:rPr>
-              <w:t xml:space="preserve"/>
+              <w:t>Que TF-IDF y similitud léxica bastaban para clasificar y detectar cualquier nivel de proximidad en videojuegos.</w:t>
             </w:r>
           </w:p>
         </w:tc>
@@ -2506,14 +2247,7 @@
           </w:tcPr>
           <w:p>
             <w:r>
-              <w:rPr>
-                <w:b w:val="false"/>
-                <w:bCs w:val="false"/>
-                <w:color w:val="1B2233"/>
-                <w:sz w:val="20"/>
-                <w:szCs w:val="20"/>
-              </w:rPr>
-              <w:t xml:space="preserve"/>
+              <w:t>Que el texto solo arroja muchos falsos positivos en juegos del mismo género (precisión 47.9%), pero la combinación multimodal texto+imagen alcanza 100% de precisión.</w:t>
             </w:r>
           </w:p>
         </w:tc>
@@ -2571,14 +2305,7 @@
           </w:tcPr>
           <w:p>
             <w:r>
-              <w:rPr>
-                <w:b w:val="false"/>
-                <w:bCs w:val="false"/>
-                <w:color w:val="1B2233"/>
-                <w:sz w:val="20"/>
-                <w:szCs w:val="20"/>
-              </w:rPr>
-              <w:t xml:space="preserve"/>
+              <w:t>Que la multimodalidad (visión + NLP) con clustering no supervisado DBSCAN es el enfoque técnico idóneo para detectar patrones de réplicas en videojuegos.</w:t>
             </w:r>
           </w:p>
         </w:tc>
@@ -2636,26 +2363,9 @@
           </w:tcPr>
           <w:p>
             <w:r>
-              <w:rPr>
-                <w:b w:val="false"/>
-                <w:bCs w:val="false"/>
-                <w:color w:val="1B2233"/>
-                <w:sz w:val="20"/>
-                <w:szCs w:val="20"/>
-              </w:rPr>
-              <w:t xml:space="preserve">[  ] Perseverar     [  ] Pivotar     [  ] Archivar</w:t>
-            </w:r>
-          </w:p>
-          <w:p>
-            <w:r>
-              <w:rPr>
-                <w:b w:val="false"/>
-                <w:bCs w:val="false"/>
-                <w:color w:val="1B2233"/>
-                <w:sz w:val="20"/>
-                <w:szCs w:val="20"/>
-              </w:rPr>
-              <w:t xml:space="preserve">Porque:</w:t>
+              <w:t>[X] Perseverar     [ ] Pivotar     [ ] Archivar</w:t>
+              <w:br/>
+              <w:t>Porque: Los resultados experimentales validan plenamente la hipótesis central del Capstone y proporcionan una base sólida para el informe final.</w:t>
             </w:r>
           </w:p>
         </w:tc>
@@ -2843,14 +2553,7 @@
           </w:tcPr>
           <w:p>
             <w:r>
-              <w:rPr>
-                <w:b w:val="false"/>
-                <w:bCs w:val="false"/>
-                <w:color w:val="1B2233"/>
-                <w:sz w:val="20"/>
-                <w:szCs w:val="20"/>
-              </w:rPr>
-              <w:t xml:space="preserve"/>
+              <w:t>Google Colab / Gemini</w:t>
             </w:r>
           </w:p>
         </w:tc>
@@ -2872,14 +2575,7 @@
           </w:tcPr>
           <w:p>
             <w:r>
-              <w:rPr>
-                <w:b w:val="false"/>
-                <w:bCs w:val="false"/>
-                <w:color w:val="1B2233"/>
-                <w:sz w:val="20"/>
-                <w:szCs w:val="20"/>
-              </w:rPr>
-              <w:t xml:space="preserve"/>
+              <w:t>Genera un pipeline experimental con DBSCAN y barrido de eps para evaluar precisión/recall por pares en detección de clones de videojuegos.</w:t>
             </w:r>
           </w:p>
         </w:tc>
@@ -2901,14 +2597,7 @@
           </w:tcPr>
           <w:p>
             <w:r>
-              <w:rPr>
-                <w:b w:val="false"/>
-                <w:bCs w:val="false"/>
-                <w:color w:val="1B2233"/>
-                <w:sz w:val="20"/>
-                <w:szCs w:val="20"/>
-              </w:rPr>
-              <w:t xml:space="preserve"/>
+              <w:t>Construir el notebook FairPlay_AI_DBSCAN_Clones.ipynb con cálculo de F1 y ARI para comparar línea base vs modelo multimodal.</w:t>
             </w:r>
           </w:p>
         </w:tc>
@@ -2930,14 +2619,7 @@
           </w:tcPr>
           <w:p>
             <w:r>
-              <w:rPr>
-                <w:b w:val="false"/>
-                <w:bCs w:val="false"/>
-                <w:color w:val="1B2233"/>
-                <w:sz w:val="20"/>
-                <w:szCs w:val="20"/>
-              </w:rPr>
-              <w:t xml:space="preserve"/>
+              <w:t>Sí, adaptamos los casos sintéticos para reflejar casos reales como Escape the Walls y juegos señuelo.</w:t>
             </w:r>
           </w:p>
         </w:tc>
@@ -2965,14 +2647,7 @@
           </w:tcPr>
           <w:p>
             <w:r>
-              <w:rPr>
-                <w:b w:val="false"/>
-                <w:bCs w:val="false"/>
-                <w:color w:val="1B2233"/>
-                <w:sz w:val="20"/>
-                <w:szCs w:val="20"/>
-              </w:rPr>
-              <w:t xml:space="preserve"/>
+              <w:t>ChatGPT / Claude</w:t>
             </w:r>
           </w:p>
         </w:tc>
@@ -2994,14 +2669,7 @@
           </w:tcPr>
           <w:p>
             <w:r>
-              <w:rPr>
-                <w:b w:val="false"/>
-                <w:bCs w:val="false"/>
-                <w:color w:val="1B2233"/>
-                <w:sz w:val="20"/>
-                <w:szCs w:val="20"/>
-              </w:rPr>
-              <w:t xml:space="preserve"/>
+              <w:t>Estructura la función matemática de descomposición de aportes de términos en similitud coseno para obtener un DataFrame explicable.</w:t>
             </w:r>
           </w:p>
         </w:tc>
@@ -3023,14 +2691,7 @@
           </w:tcPr>
           <w:p>
             <w:r>
-              <w:rPr>
-                <w:b w:val="false"/>
-                <w:bCs w:val="false"/>
-                <w:color w:val="1B2233"/>
-                <w:sz w:val="20"/>
-                <w:szCs w:val="20"/>
-              </w:rPr>
-              <w:t xml:space="preserve"/>
+              <w:t>Diseñar e implementar comparar() y terminos_compartidos() en similitud.py multiplicando vectores elemento a elemento.</w:t>
             </w:r>
           </w:p>
         </w:tc>
@@ -3052,14 +2713,7 @@
           </w:tcPr>
           <w:p>
             <w:r>
-              <w:rPr>
-                <w:b w:val="false"/>
-                <w:bCs w:val="false"/>
-                <w:color w:val="1B2233"/>
-                <w:sz w:val="20"/>
-                <w:szCs w:val="20"/>
-              </w:rPr>
-              <w:t xml:space="preserve"/>
+              <w:t>Sí, adaptamos el ordenamiento por aporte descendente y formateo de decimales.</w:t>
             </w:r>
           </w:p>
         </w:tc>
@@ -3087,14 +2741,7 @@
           </w:tcPr>
           <w:p>
             <w:r>
-              <w:rPr>
-                <w:b w:val="false"/>
-                <w:bCs w:val="false"/>
-                <w:color w:val="1B2233"/>
-                <w:sz w:val="20"/>
-                <w:szCs w:val="20"/>
-              </w:rPr>
-              <w:t xml:space="preserve"/>
+              <w:t>Antigravity IDE</w:t>
             </w:r>
           </w:p>
         </w:tc>
@@ -3116,14 +2763,7 @@
           </w:tcPr>
           <w:p>
             <w:r>
-              <w:rPr>
-                <w:b w:val="false"/>
-                <w:bCs w:val="false"/>
-                <w:color w:val="1B2233"/>
-                <w:sz w:val="20"/>
-                <w:szCs w:val="20"/>
-              </w:rPr>
-              <w:t xml:space="preserve"/>
+              <w:t>Analiza el informe mirror, el prototipo y el notebook DBSCAN para articular la hoja de trabajo Capstone y pitch con métricas exactas.</w:t>
             </w:r>
           </w:p>
         </w:tc>
@@ -3145,14 +2785,7 @@
           </w:tcPr>
           <w:p>
             <w:r>
-              <w:rPr>
-                <w:b w:val="false"/>
-                <w:bCs w:val="false"/>
-                <w:color w:val="1B2233"/>
-                <w:sz w:val="20"/>
-                <w:szCs w:val="20"/>
-              </w:rPr>
-              <w:t xml:space="preserve"/>
+              <w:t>Articular la coherencia entre problemática de la industria, solución técnica y guion de presentación de Clase 9.</w:t>
             </w:r>
           </w:p>
         </w:tc>
@@ -3174,14 +2807,7 @@
           </w:tcPr>
           <w:p>
             <w:r>
-              <w:rPr>
-                <w:b w:val="false"/>
-                <w:bCs w:val="false"/>
-                <w:color w:val="1B2233"/>
-                <w:sz w:val="20"/>
-                <w:szCs w:val="20"/>
-              </w:rPr>
-              <w:t xml:space="preserve"/>
+              <w:t>Sí, se incorporaron los resultados cuantitativos de F1, precisión y los 3 casos de prueba.</w:t>
             </w:r>
           </w:p>
         </w:tc>

</xml_diff>